<commit_message>
Update session notes, enhance certifications section, and add ATS resume files
</commit_message>
<xml_diff>
--- a/Resume-Rahul_Monde.ATS.docx
+++ b/Resume-Rahul_Monde.ATS.docx
@@ -91,7 +91,7 @@
         </w:rPr>
         <w:t xml:space="preserve">  |  </w:t>
       </w:r>
-      <w:hyperlink w:history="1" r:id="rIda8ccrlo-s03kxgunjbh5i">
+      <w:hyperlink w:history="1" r:id="rIduiranjaipgtwoj8sxbdxk">
         <w:r>
           <w:rPr>
             <w:rFonts w:ascii="Arial" w:cs="Arial" w:eastAsia="Arial" w:hAnsi="Arial"/>
@@ -109,7 +109,7 @@
         <w:spacing w:after="80"/>
         <w:jc w:val="center"/>
       </w:pPr>
-      <w:hyperlink w:history="1" r:id="rIdp55zys-udbkmqdwjuxxdh">
+      <w:hyperlink w:history="1" r:id="rIdsr3edioquunrbwnrj86tx">
         <w:r>
           <w:rPr>
             <w:rFonts w:ascii="Arial" w:cs="Arial" w:eastAsia="Arial" w:hAnsi="Arial"/>
@@ -130,7 +130,7 @@
         </w:rPr>
         <w:t xml:space="preserve">  |  </w:t>
       </w:r>
-      <w:hyperlink w:history="1" r:id="rId6at9jvml70rpmaqrfgtpc">
+      <w:hyperlink w:history="1" r:id="rId3i56vc8ycxbh6wpe6cbfo">
         <w:r>
           <w:rPr>
             <w:rFonts w:ascii="Arial" w:cs="Arial" w:eastAsia="Arial" w:hAnsi="Arial"/>
@@ -151,7 +151,7 @@
         </w:rPr>
         <w:t xml:space="preserve">  |  </w:t>
       </w:r>
-      <w:hyperlink w:history="1" r:id="rIdx924xfevftnb1ve1scnpl">
+      <w:hyperlink w:history="1" r:id="rIdhkes1z8mwolvdffdbdcao">
         <w:r>
           <w:rPr>
             <w:rFonts w:ascii="Arial" w:cs="Arial" w:eastAsia="Arial" w:hAnsi="Arial"/>
@@ -163,10 +163,28 @@
           <w:t xml:space="preserve">github.com/rmonde</w:t>
         </w:r>
       </w:hyperlink>
-    </w:p>
-    <w:p>
-      <w:pPr>
-        <w:spacing w:after="0" w:before="140"/>
+      <w:r>
+        <w:rPr>
+          <w:rFonts w:ascii="Arial" w:cs="Arial" w:eastAsia="Arial" w:hAnsi="Arial"/>
+          <w:color w:val="999999"/>
+          <w:sz w:val="20"/>
+          <w:szCs w:val="20"/>
+        </w:rPr>
+        <w:t xml:space="preserve">  |  </w:t>
+      </w:r>
+      <w:r>
+        <w:rPr>
+          <w:rFonts w:ascii="Arial" w:cs="Arial" w:eastAsia="Arial" w:hAnsi="Arial"/>
+          <w:color w:val="555555"/>
+          <w:sz w:val="20"/>
+          <w:szCs w:val="20"/>
+        </w:rPr>
+        <w:t xml:space="preserve">English · Hindi · Marathi</w:t>
+      </w:r>
+    </w:p>
+    <w:p>
+      <w:pPr>
+        <w:spacing w:after="0" w:before="90"/>
       </w:pPr>
       <w:r>
         <w:rPr>
@@ -211,7 +229,7 @@
     </w:p>
     <w:p>
       <w:pPr>
-        <w:spacing w:after="0" w:before="140"/>
+        <w:spacing w:after="0" w:before="90"/>
       </w:pPr>
       <w:r>
         <w:rPr>
@@ -248,7 +266,7 @@
           <w:ilvl w:val="0"/>
           <w:numId w:val="2"/>
         </w:numPr>
-        <w:spacing w:after="20" w:before="20" w:line="240"/>
+        <w:spacing w:after="10" w:before="10" w:line="240"/>
       </w:pPr>
       <w:r>
         <w:rPr>
@@ -276,7 +294,7 @@
           <w:ilvl w:val="0"/>
           <w:numId w:val="2"/>
         </w:numPr>
-        <w:spacing w:after="20" w:before="20" w:line="240"/>
+        <w:spacing w:after="10" w:before="10" w:line="240"/>
       </w:pPr>
       <w:r>
         <w:rPr>
@@ -304,7 +322,7 @@
           <w:ilvl w:val="0"/>
           <w:numId w:val="2"/>
         </w:numPr>
-        <w:spacing w:after="20" w:before="20" w:line="240"/>
+        <w:spacing w:after="10" w:before="10" w:line="240"/>
       </w:pPr>
       <w:r>
         <w:rPr>
@@ -332,7 +350,7 @@
           <w:ilvl w:val="0"/>
           <w:numId w:val="2"/>
         </w:numPr>
-        <w:spacing w:after="20" w:before="20" w:line="240"/>
+        <w:spacing w:after="10" w:before="10" w:line="240"/>
       </w:pPr>
       <w:r>
         <w:rPr>
@@ -360,7 +378,7 @@
           <w:ilvl w:val="0"/>
           <w:numId w:val="2"/>
         </w:numPr>
-        <w:spacing w:after="20" w:before="20" w:line="240"/>
+        <w:spacing w:after="10" w:before="10" w:line="240"/>
       </w:pPr>
       <w:r>
         <w:rPr>
@@ -388,7 +406,7 @@
           <w:ilvl w:val="0"/>
           <w:numId w:val="2"/>
         </w:numPr>
-        <w:spacing w:after="20" w:before="20" w:line="240"/>
+        <w:spacing w:after="10" w:before="10" w:line="240"/>
       </w:pPr>
       <w:r>
         <w:rPr>
@@ -416,7 +434,7 @@
           <w:ilvl w:val="0"/>
           <w:numId w:val="2"/>
         </w:numPr>
-        <w:spacing w:after="20" w:before="20" w:line="240"/>
+        <w:spacing w:after="10" w:before="10" w:line="240"/>
       </w:pPr>
       <w:r>
         <w:rPr>
@@ -444,7 +462,7 @@
           <w:ilvl w:val="0"/>
           <w:numId w:val="2"/>
         </w:numPr>
-        <w:spacing w:after="20" w:before="20" w:line="240"/>
+        <w:spacing w:after="10" w:before="10" w:line="240"/>
       </w:pPr>
       <w:r>
         <w:rPr>
@@ -472,7 +490,7 @@
           <w:ilvl w:val="0"/>
           <w:numId w:val="2"/>
         </w:numPr>
-        <w:spacing w:after="20" w:before="20" w:line="240"/>
+        <w:spacing w:after="10" w:before="10" w:line="240"/>
       </w:pPr>
       <w:r>
         <w:rPr>
@@ -500,7 +518,7 @@
           <w:ilvl w:val="0"/>
           <w:numId w:val="2"/>
         </w:numPr>
-        <w:spacing w:after="20" w:before="20" w:line="240"/>
+        <w:spacing w:after="10" w:before="10" w:line="240"/>
       </w:pPr>
       <w:r>
         <w:rPr>
@@ -523,7 +541,7 @@
     </w:p>
     <w:p>
       <w:pPr>
-        <w:spacing w:after="0" w:before="140"/>
+        <w:spacing w:after="0" w:before="90"/>
       </w:pPr>
       <w:r>
         <w:rPr>
@@ -555,91 +573,210 @@
     </w:p>
     <w:p>
       <w:pPr>
-        <w:pStyle w:val="ListParagraph"/>
-        <w:numPr>
-          <w:ilvl w:val="0"/>
-          <w:numId w:val="2"/>
-        </w:numPr>
-        <w:spacing w:after="20" w:before="20" w:line="240"/>
-      </w:pPr>
-      <w:r>
-        <w:rPr>
-          <w:rFonts w:ascii="Arial" w:cs="Arial" w:eastAsia="Arial" w:hAnsi="Arial"/>
-          <w:b/>
-          <w:bCs/>
-          <w:sz w:val="22"/>
-          <w:szCs w:val="22"/>
-        </w:rPr>
-        <w:t xml:space="preserve">Microsoft Certified: Azure AI Engineer Associate (AI-102) </w:t>
-      </w:r>
-      <w:r>
-        <w:rPr>
-          <w:rFonts w:ascii="Arial" w:cs="Arial" w:eastAsia="Arial" w:hAnsi="Arial"/>
-          <w:sz w:val="22"/>
-          <w:szCs w:val="22"/>
-        </w:rPr>
-        <w:t xml:space="preserve">— in progress, target 2026. Focus: Azure AI Foundry, Azure AI Search, responsible AI.</w:t>
-      </w:r>
-    </w:p>
-    <w:p>
-      <w:pPr>
-        <w:pStyle w:val="ListParagraph"/>
-        <w:numPr>
-          <w:ilvl w:val="0"/>
-          <w:numId w:val="2"/>
-        </w:numPr>
-        <w:spacing w:after="20" w:before="20" w:line="240"/>
-      </w:pPr>
-      <w:r>
-        <w:rPr>
-          <w:rFonts w:ascii="Arial" w:cs="Arial" w:eastAsia="Arial" w:hAnsi="Arial"/>
-          <w:b/>
-          <w:bCs/>
-          <w:sz w:val="22"/>
-          <w:szCs w:val="22"/>
-        </w:rPr>
-        <w:t xml:space="preserve">Google Cloud — Generative AI </w:t>
-      </w:r>
-      <w:r>
-        <w:rPr>
-          <w:rFonts w:ascii="Arial" w:cs="Arial" w:eastAsia="Arial" w:hAnsi="Arial"/>
-          <w:sz w:val="22"/>
-          <w:szCs w:val="22"/>
-        </w:rPr>
-        <w:t xml:space="preserve">— completed. Generative AI fundamentals on Google Cloud.</w:t>
-      </w:r>
-    </w:p>
-    <w:p>
-      <w:pPr>
-        <w:pStyle w:val="ListParagraph"/>
-        <w:numPr>
-          <w:ilvl w:val="0"/>
-          <w:numId w:val="2"/>
-        </w:numPr>
-        <w:spacing w:after="20" w:before="20" w:line="240"/>
-      </w:pPr>
-      <w:r>
-        <w:rPr>
-          <w:rFonts w:ascii="Arial" w:cs="Arial" w:eastAsia="Arial" w:hAnsi="Arial"/>
-          <w:b/>
-          <w:bCs/>
-          <w:sz w:val="22"/>
-          <w:szCs w:val="22"/>
-        </w:rPr>
-        <w:t xml:space="preserve">Certified Kubernetes Administrator (CKA) </w:t>
-      </w:r>
-      <w:r>
-        <w:rPr>
-          <w:rFonts w:ascii="Arial" w:cs="Arial" w:eastAsia="Arial" w:hAnsi="Arial"/>
-          <w:sz w:val="22"/>
-          <w:szCs w:val="22"/>
-        </w:rPr>
-        <w:t xml:space="preserve">— CNCF / Linux Foundation. Previously certified; hands-on Kubernetes administration skills retained.</w:t>
-      </w:r>
-    </w:p>
-    <w:p>
-      <w:pPr>
-        <w:spacing w:after="0" w:before="140"/>
+        <w:spacing w:after="40" w:before="30" w:line="240"/>
+      </w:pPr>
+      <w:r>
+        <w:rPr>
+          <w:rFonts w:ascii="Arial" w:cs="Arial" w:eastAsia="Arial" w:hAnsi="Arial"/>
+          <w:sz w:val="22"/>
+          <w:szCs w:val="22"/>
+        </w:rPr>
+        <w:t xml:space="preserve">13 certifications across Microsoft Azure, Google Cloud, AWS and CNCF — full wallet verifiable at </w:t>
+      </w:r>
+      <w:hyperlink w:history="1" r:id="rIdztf7poq4jati54wcpbhym">
+        <w:r>
+          <w:rPr>
+            <w:rFonts w:ascii="Arial" w:cs="Arial" w:eastAsia="Arial" w:hAnsi="Arial"/>
+            <w:color w:val="4361EE"/>
+            <w:sz w:val="22"/>
+            <w:szCs w:val="22"/>
+            <w:u w:val="single"/>
+          </w:rPr>
+          <w:t xml:space="preserve">credly.com/users/rahul-monde</w:t>
+        </w:r>
+      </w:hyperlink>
+      <w:r>
+        <w:rPr>
+          <w:rFonts w:ascii="Arial" w:cs="Arial" w:eastAsia="Arial" w:hAnsi="Arial"/>
+          <w:sz w:val="22"/>
+          <w:szCs w:val="22"/>
+        </w:rPr>
+        <w:t xml:space="preserve">.</w:t>
+      </w:r>
+    </w:p>
+    <w:p>
+      <w:pPr>
+        <w:pStyle w:val="ListParagraph"/>
+        <w:numPr>
+          <w:ilvl w:val="0"/>
+          <w:numId w:val="2"/>
+        </w:numPr>
+        <w:spacing w:after="10" w:before="10" w:line="240"/>
+      </w:pPr>
+      <w:r>
+        <w:rPr>
+          <w:rFonts w:ascii="Arial" w:cs="Arial" w:eastAsia="Arial" w:hAnsi="Arial"/>
+          <w:b/>
+          <w:bCs/>
+          <w:color w:val="0F7D3D"/>
+          <w:sz w:val="22"/>
+          <w:szCs w:val="22"/>
+        </w:rPr>
+        <w:t xml:space="preserve">Active: </w:t>
+      </w:r>
+      <w:r>
+        <w:rPr>
+          <w:rFonts w:ascii="Arial" w:cs="Arial" w:eastAsia="Arial" w:hAnsi="Arial"/>
+          <w:sz w:val="22"/>
+          <w:szCs w:val="22"/>
+        </w:rPr>
+        <w:t xml:space="preserve">Generative AI Leader Certification — Google Cloud. Expires September 2028.</w:t>
+      </w:r>
+    </w:p>
+    <w:p>
+      <w:pPr>
+        <w:pStyle w:val="ListParagraph"/>
+        <w:numPr>
+          <w:ilvl w:val="0"/>
+          <w:numId w:val="2"/>
+        </w:numPr>
+        <w:spacing w:after="10" w:before="10" w:line="240"/>
+      </w:pPr>
+      <w:r>
+        <w:rPr>
+          <w:rFonts w:ascii="Arial" w:cs="Arial" w:eastAsia="Arial" w:hAnsi="Arial"/>
+          <w:b/>
+          <w:bCs/>
+          <w:color w:val="B7791F"/>
+          <w:sz w:val="22"/>
+          <w:szCs w:val="22"/>
+        </w:rPr>
+        <w:t xml:space="preserve">In progress: </w:t>
+      </w:r>
+      <w:r>
+        <w:rPr>
+          <w:rFonts w:ascii="Arial" w:cs="Arial" w:eastAsia="Arial" w:hAnsi="Arial"/>
+          <w:sz w:val="22"/>
+          <w:szCs w:val="22"/>
+        </w:rPr>
+        <w:t xml:space="preserve">Microsoft Certified: Azure AI Engineer Associate (AI-102) — target 2026. Focus: Azure AI Foundry, Azure AI Search, responsible AI.</w:t>
+      </w:r>
+    </w:p>
+    <w:p>
+      <w:pPr>
+        <w:pStyle w:val="ListParagraph"/>
+        <w:numPr>
+          <w:ilvl w:val="0"/>
+          <w:numId w:val="2"/>
+        </w:numPr>
+        <w:spacing w:after="10" w:before="10" w:line="240"/>
+      </w:pPr>
+      <w:r>
+        <w:rPr>
+          <w:rFonts w:ascii="Arial" w:cs="Arial" w:eastAsia="Arial" w:hAnsi="Arial"/>
+          <w:b/>
+          <w:bCs/>
+          <w:sz w:val="22"/>
+          <w:szCs w:val="22"/>
+        </w:rPr>
+        <w:t xml:space="preserve">Previously held — Microsoft Azure: </w:t>
+      </w:r>
+      <w:r>
+        <w:rPr>
+          <w:rFonts w:ascii="Arial" w:cs="Arial" w:eastAsia="Arial" w:hAnsi="Arial"/>
+          <w:sz w:val="22"/>
+          <w:szCs w:val="22"/>
+        </w:rPr>
+        <w:t xml:space="preserve">DevOps Engineer Expert (AZ-400, 2022); Azure Security Engineer Associate (AZ-500, 2023); Azure Administrator Associate (AZ-104, 2022).</w:t>
+      </w:r>
+    </w:p>
+    <w:p>
+      <w:pPr>
+        <w:pStyle w:val="ListParagraph"/>
+        <w:numPr>
+          <w:ilvl w:val="0"/>
+          <w:numId w:val="2"/>
+        </w:numPr>
+        <w:spacing w:after="10" w:before="10" w:line="240"/>
+      </w:pPr>
+      <w:r>
+        <w:rPr>
+          <w:rFonts w:ascii="Arial" w:cs="Arial" w:eastAsia="Arial" w:hAnsi="Arial"/>
+          <w:b/>
+          <w:bCs/>
+          <w:sz w:val="22"/>
+          <w:szCs w:val="22"/>
+        </w:rPr>
+        <w:t xml:space="preserve">Previously held — Google Cloud: </w:t>
+      </w:r>
+      <w:r>
+        <w:rPr>
+          <w:rFonts w:ascii="Arial" w:cs="Arial" w:eastAsia="Arial" w:hAnsi="Arial"/>
+          <w:sz w:val="22"/>
+          <w:szCs w:val="22"/>
+        </w:rPr>
+        <w:t xml:space="preserve">Professional Cloud Architect (2021); Professional Data Engineer (2021); Associate Cloud Engineer (2025).</w:t>
+      </w:r>
+    </w:p>
+    <w:p>
+      <w:pPr>
+        <w:pStyle w:val="ListParagraph"/>
+        <w:numPr>
+          <w:ilvl w:val="0"/>
+          <w:numId w:val="2"/>
+        </w:numPr>
+        <w:spacing w:after="10" w:before="10" w:line="240"/>
+      </w:pPr>
+      <w:r>
+        <w:rPr>
+          <w:rFonts w:ascii="Arial" w:cs="Arial" w:eastAsia="Arial" w:hAnsi="Arial"/>
+          <w:b/>
+          <w:bCs/>
+          <w:sz w:val="22"/>
+          <w:szCs w:val="22"/>
+        </w:rPr>
+        <w:t xml:space="preserve">Previously held — Amazon Web Services: </w:t>
+      </w:r>
+      <w:r>
+        <w:rPr>
+          <w:rFonts w:ascii="Arial" w:cs="Arial" w:eastAsia="Arial" w:hAnsi="Arial"/>
+          <w:sz w:val="22"/>
+          <w:szCs w:val="22"/>
+        </w:rPr>
+        <w:t xml:space="preserve">Solutions Architect — Professional (2020); DevOps Engineer — Professional (2021); Solutions Architect — Associate (2020); SysOps Administrator — Associate (2021).</w:t>
+      </w:r>
+    </w:p>
+    <w:p>
+      <w:pPr>
+        <w:pStyle w:val="ListParagraph"/>
+        <w:numPr>
+          <w:ilvl w:val="0"/>
+          <w:numId w:val="2"/>
+        </w:numPr>
+        <w:spacing w:after="10" w:before="10" w:line="240"/>
+      </w:pPr>
+      <w:r>
+        <w:rPr>
+          <w:rFonts w:ascii="Arial" w:cs="Arial" w:eastAsia="Arial" w:hAnsi="Arial"/>
+          <w:b/>
+          <w:bCs/>
+          <w:sz w:val="22"/>
+          <w:szCs w:val="22"/>
+        </w:rPr>
+        <w:t xml:space="preserve">Previously held — CNCF / Linux Foundation: </w:t>
+      </w:r>
+      <w:r>
+        <w:rPr>
+          <w:rFonts w:ascii="Arial" w:cs="Arial" w:eastAsia="Arial" w:hAnsi="Arial"/>
+          <w:sz w:val="22"/>
+          <w:szCs w:val="22"/>
+        </w:rPr>
+        <w:t xml:space="preserve">Certified Kubernetes Administrator (CKA, 2024).</w:t>
+      </w:r>
+    </w:p>
+    <w:p>
+      <w:pPr>
+        <w:spacing w:after="0" w:before="90"/>
       </w:pPr>
       <w:r>
         <w:rPr>
@@ -674,7 +811,7 @@
         <w:tabs>
           <w:tab w:val="right" w:pos="9360"/>
         </w:tabs>
-        <w:spacing w:after="0" w:before="120"/>
+        <w:spacing w:after="0" w:before="90"/>
       </w:pPr>
       <w:r>
         <w:rPr>
@@ -707,7 +844,7 @@
     </w:p>
     <w:p>
       <w:pPr>
-        <w:spacing w:after="60" w:before="20"/>
+        <w:spacing w:after="40" w:before="20"/>
       </w:pPr>
       <w:r>
         <w:rPr>
@@ -728,7 +865,7 @@
           <w:ilvl w:val="0"/>
           <w:numId w:val="2"/>
         </w:numPr>
-        <w:spacing w:after="20" w:before="20" w:line="240"/>
+        <w:spacing w:after="10" w:before="10" w:line="240"/>
       </w:pPr>
       <w:r>
         <w:rPr>
@@ -746,7 +883,7 @@
           <w:ilvl w:val="0"/>
           <w:numId w:val="2"/>
         </w:numPr>
-        <w:spacing w:after="20" w:before="20" w:line="240"/>
+        <w:spacing w:after="10" w:before="10" w:line="240"/>
       </w:pPr>
       <w:r>
         <w:rPr>
@@ -764,7 +901,7 @@
           <w:ilvl w:val="0"/>
           <w:numId w:val="2"/>
         </w:numPr>
-        <w:spacing w:after="20" w:before="20" w:line="240"/>
+        <w:spacing w:after="10" w:before="10" w:line="240"/>
       </w:pPr>
       <w:r>
         <w:rPr>
@@ -782,7 +919,7 @@
           <w:ilvl w:val="0"/>
           <w:numId w:val="2"/>
         </w:numPr>
-        <w:spacing w:after="20" w:before="20" w:line="240"/>
+        <w:spacing w:after="10" w:before="10" w:line="240"/>
       </w:pPr>
       <w:r>
         <w:rPr>
@@ -800,7 +937,7 @@
           <w:ilvl w:val="0"/>
           <w:numId w:val="2"/>
         </w:numPr>
-        <w:spacing w:after="20" w:before="20" w:line="240"/>
+        <w:spacing w:after="10" w:before="10" w:line="240"/>
       </w:pPr>
       <w:r>
         <w:rPr>
@@ -818,7 +955,7 @@
           <w:ilvl w:val="0"/>
           <w:numId w:val="2"/>
         </w:numPr>
-        <w:spacing w:after="20" w:before="20" w:line="240"/>
+        <w:spacing w:after="10" w:before="10" w:line="240"/>
       </w:pPr>
       <w:r>
         <w:rPr>
@@ -836,7 +973,7 @@
           <w:ilvl w:val="0"/>
           <w:numId w:val="2"/>
         </w:numPr>
-        <w:spacing w:after="20" w:before="20" w:line="240"/>
+        <w:spacing w:after="10" w:before="10" w:line="240"/>
       </w:pPr>
       <w:r>
         <w:rPr>
@@ -854,7 +991,7 @@
           <w:ilvl w:val="0"/>
           <w:numId w:val="2"/>
         </w:numPr>
-        <w:spacing w:after="20" w:before="20" w:line="240"/>
+        <w:spacing w:after="10" w:before="10" w:line="240"/>
       </w:pPr>
       <w:r>
         <w:rPr>
@@ -872,7 +1009,7 @@
           <w:ilvl w:val="0"/>
           <w:numId w:val="2"/>
         </w:numPr>
-        <w:spacing w:after="20" w:before="20" w:line="240"/>
+        <w:spacing w:after="10" w:before="10" w:line="240"/>
       </w:pPr>
       <w:r>
         <w:rPr>
@@ -888,7 +1025,7 @@
         <w:tabs>
           <w:tab w:val="right" w:pos="9360"/>
         </w:tabs>
-        <w:spacing w:after="0" w:before="120"/>
+        <w:spacing w:after="0" w:before="90"/>
       </w:pPr>
       <w:r>
         <w:rPr>
@@ -921,7 +1058,7 @@
     </w:p>
     <w:p>
       <w:pPr>
-        <w:spacing w:after="60" w:before="20"/>
+        <w:spacing w:after="40" w:before="20"/>
       </w:pPr>
       <w:r>
         <w:rPr>
@@ -942,7 +1079,7 @@
           <w:ilvl w:val="0"/>
           <w:numId w:val="2"/>
         </w:numPr>
-        <w:spacing w:after="20" w:before="20" w:line="240"/>
+        <w:spacing w:after="10" w:before="10" w:line="240"/>
       </w:pPr>
       <w:r>
         <w:rPr>
@@ -960,7 +1097,7 @@
           <w:ilvl w:val="0"/>
           <w:numId w:val="2"/>
         </w:numPr>
-        <w:spacing w:after="20" w:before="20" w:line="240"/>
+        <w:spacing w:after="10" w:before="10" w:line="240"/>
       </w:pPr>
       <w:r>
         <w:rPr>
@@ -978,7 +1115,7 @@
           <w:ilvl w:val="0"/>
           <w:numId w:val="2"/>
         </w:numPr>
-        <w:spacing w:after="20" w:before="20" w:line="240"/>
+        <w:spacing w:after="10" w:before="10" w:line="240"/>
       </w:pPr>
       <w:r>
         <w:rPr>
@@ -994,7 +1131,7 @@
         <w:tabs>
           <w:tab w:val="right" w:pos="9360"/>
         </w:tabs>
-        <w:spacing w:after="0" w:before="120"/>
+        <w:spacing w:after="0" w:before="90"/>
       </w:pPr>
       <w:r>
         <w:rPr>
@@ -1027,7 +1164,7 @@
     </w:p>
     <w:p>
       <w:pPr>
-        <w:spacing w:after="60" w:before="20"/>
+        <w:spacing w:after="40" w:before="20"/>
       </w:pPr>
       <w:r>
         <w:rPr>
@@ -1048,7 +1185,7 @@
           <w:ilvl w:val="0"/>
           <w:numId w:val="2"/>
         </w:numPr>
-        <w:spacing w:after="20" w:before="20" w:line="240"/>
+        <w:spacing w:after="10" w:before="10" w:line="240"/>
       </w:pPr>
       <w:r>
         <w:rPr>
@@ -1066,7 +1203,7 @@
           <w:ilvl w:val="0"/>
           <w:numId w:val="2"/>
         </w:numPr>
-        <w:spacing w:after="20" w:before="20" w:line="240"/>
+        <w:spacing w:after="10" w:before="10" w:line="240"/>
       </w:pPr>
       <w:r>
         <w:rPr>
@@ -1082,7 +1219,7 @@
         <w:tabs>
           <w:tab w:val="right" w:pos="9360"/>
         </w:tabs>
-        <w:spacing w:after="0" w:before="120"/>
+        <w:spacing w:after="0" w:before="90"/>
       </w:pPr>
       <w:r>
         <w:rPr>
@@ -1115,7 +1252,7 @@
     </w:p>
     <w:p>
       <w:pPr>
-        <w:spacing w:after="60" w:before="20"/>
+        <w:spacing w:after="40" w:before="20"/>
       </w:pPr>
       <w:r>
         <w:rPr>
@@ -1136,7 +1273,7 @@
           <w:ilvl w:val="0"/>
           <w:numId w:val="2"/>
         </w:numPr>
-        <w:spacing w:after="20" w:before="20" w:line="240"/>
+        <w:spacing w:after="10" w:before="10" w:line="240"/>
       </w:pPr>
       <w:r>
         <w:rPr>
@@ -1154,7 +1291,7 @@
           <w:ilvl w:val="0"/>
           <w:numId w:val="2"/>
         </w:numPr>
-        <w:spacing w:after="20" w:before="20" w:line="240"/>
+        <w:spacing w:after="10" w:before="10" w:line="240"/>
       </w:pPr>
       <w:r>
         <w:rPr>
@@ -1170,7 +1307,7 @@
         <w:tabs>
           <w:tab w:val="right" w:pos="9360"/>
         </w:tabs>
-        <w:spacing w:after="0" w:before="120"/>
+        <w:spacing w:after="0" w:before="90"/>
       </w:pPr>
       <w:r>
         <w:rPr>
@@ -1203,7 +1340,7 @@
     </w:p>
     <w:p>
       <w:pPr>
-        <w:spacing w:after="60" w:before="20"/>
+        <w:spacing w:after="40" w:before="20"/>
       </w:pPr>
       <w:r>
         <w:rPr>
@@ -1224,7 +1361,7 @@
           <w:ilvl w:val="0"/>
           <w:numId w:val="2"/>
         </w:numPr>
-        <w:spacing w:after="20" w:before="20" w:line="240"/>
+        <w:spacing w:after="10" w:before="10" w:line="240"/>
       </w:pPr>
       <w:r>
         <w:rPr>
@@ -1240,7 +1377,7 @@
         <w:tabs>
           <w:tab w:val="right" w:pos="9360"/>
         </w:tabs>
-        <w:spacing w:after="0" w:before="120"/>
+        <w:spacing w:after="0" w:before="90"/>
       </w:pPr>
       <w:r>
         <w:rPr>
@@ -1273,7 +1410,7 @@
     </w:p>
     <w:p>
       <w:pPr>
-        <w:spacing w:after="60" w:before="20"/>
+        <w:spacing w:after="40" w:before="20"/>
       </w:pPr>
       <w:r>
         <w:rPr>
@@ -1294,20 +1431,20 @@
           <w:ilvl w:val="0"/>
           <w:numId w:val="2"/>
         </w:numPr>
-        <w:spacing w:after="20" w:before="20" w:line="240"/>
-      </w:pPr>
-      <w:r>
-        <w:rPr>
-          <w:rFonts w:ascii="Arial" w:cs="Arial" w:eastAsia="Arial" w:hAnsi="Arial"/>
-          <w:sz w:val="22"/>
-          <w:szCs w:val="22"/>
-        </w:rPr>
-        <w:t xml:space="preserve">First-line Unix support — handled incidents, server health checks and basic administration tasks. The role where I learned that reproducibility is everything.</w:t>
-      </w:r>
-    </w:p>
-    <w:p>
-      <w:pPr>
-        <w:spacing w:after="0" w:before="140"/>
+        <w:spacing w:after="10" w:before="10" w:line="240"/>
+      </w:pPr>
+      <w:r>
+        <w:rPr>
+          <w:rFonts w:ascii="Arial" w:cs="Arial" w:eastAsia="Arial" w:hAnsi="Arial"/>
+          <w:sz w:val="22"/>
+          <w:szCs w:val="22"/>
+        </w:rPr>
+        <w:t xml:space="preserve">First-line Unix support — handled incidents, server health checks and routine administration; where I learned that reproducibility is everything.</w:t>
+      </w:r>
+    </w:p>
+    <w:p>
+      <w:pPr>
+        <w:spacing w:after="0" w:before="90"/>
       </w:pPr>
       <w:r>
         <w:rPr>
@@ -1342,7 +1479,7 @@
         <w:tabs>
           <w:tab w:val="right" w:pos="9360"/>
         </w:tabs>
-        <w:spacing w:after="0" w:before="40"/>
+        <w:spacing w:after="0" w:before="30"/>
       </w:pPr>
       <w:r>
         <w:rPr>
@@ -1362,102 +1499,11 @@
           <w:szCs w:val="22"/>
         </w:rPr>
         <w:t xml:space="preserve">	2005 – 2008</w:t>
-      </w:r>
-    </w:p>
-    <w:p>
-      <w:pPr>
-        <w:spacing w:after="0" w:before="140"/>
-      </w:pPr>
-      <w:r>
-        <w:rPr>
-          <w:rFonts w:ascii="Arial" w:cs="Arial" w:eastAsia="Arial" w:hAnsi="Arial"/>
-          <w:b/>
-          <w:bCs/>
-          <w:color w:val="1F3A5F"/>
-          <w:spacing w:val="30"/>
-          <w:sz w:val="24"/>
-          <w:szCs w:val="24"/>
-        </w:rPr>
-        <w:t xml:space="preserve">LANGUAGES</w:t>
-      </w:r>
-    </w:p>
-    <w:p>
-      <w:pPr>
-        <w:pBdr>
-          <w:bottom w:val="single" w:color="1F3A5F" w:sz="6" w:space="1"/>
-        </w:pBdr>
-        <w:spacing w:after="80" w:before="80"/>
-      </w:pPr>
-      <w:r>
-        <w:rPr>
-          <w:sz w:val="2"/>
-          <w:szCs w:val="2"/>
-        </w:rPr>
-        <w:t xml:space="preserve"/>
-      </w:r>
-    </w:p>
-    <w:p>
-      <w:pPr>
-        <w:spacing w:after="60" w:before="40"/>
-      </w:pPr>
-      <w:r>
-        <w:rPr>
-          <w:rFonts w:ascii="Arial" w:cs="Arial" w:eastAsia="Arial" w:hAnsi="Arial"/>
-          <w:b/>
-          <w:bCs/>
-          <w:sz w:val="22"/>
-          <w:szCs w:val="22"/>
-        </w:rPr>
-        <w:t xml:space="preserve">English </w:t>
-      </w:r>
-      <w:r>
-        <w:rPr>
-          <w:rFonts w:ascii="Arial" w:cs="Arial" w:eastAsia="Arial" w:hAnsi="Arial"/>
-          <w:sz w:val="22"/>
-          <w:szCs w:val="22"/>
-        </w:rPr>
-        <w:t xml:space="preserve">(professional)  ·  </w:t>
-      </w:r>
-      <w:r>
-        <w:rPr>
-          <w:rFonts w:ascii="Arial" w:cs="Arial" w:eastAsia="Arial" w:hAnsi="Arial"/>
-          <w:b/>
-          <w:bCs/>
-          <w:sz w:val="22"/>
-          <w:szCs w:val="22"/>
-        </w:rPr>
-        <w:t xml:space="preserve">Hindi </w:t>
-      </w:r>
-      <w:r>
-        <w:rPr>
-          <w:rFonts w:ascii="Arial" w:cs="Arial" w:eastAsia="Arial" w:hAnsi="Arial"/>
-          <w:sz w:val="22"/>
-          <w:szCs w:val="22"/>
-        </w:rPr>
-        <w:t xml:space="preserve">(native)  ·  </w:t>
-      </w:r>
-      <w:r>
-        <w:rPr>
-          <w:rFonts w:ascii="Arial" w:cs="Arial" w:eastAsia="Arial" w:hAnsi="Arial"/>
-          <w:b/>
-          <w:bCs/>
-          <w:sz w:val="22"/>
-          <w:szCs w:val="22"/>
-        </w:rPr>
-        <w:t xml:space="preserve">Marathi </w:t>
-      </w:r>
-      <w:r>
-        <w:rPr>
-          <w:rFonts w:ascii="Arial" w:cs="Arial" w:eastAsia="Arial" w:hAnsi="Arial"/>
-          <w:sz w:val="22"/>
-          <w:szCs w:val="22"/>
-        </w:rPr>
-        <w:t xml:space="preserve">(native)</w:t>
       </w:r>
     </w:p>
     <w:sectPr>
       <w:pgSz w:w="12240" w:h="15840" w:orient="portrait"/>
-      <w:pgMar w:top="720" w:right="1080" w:bottom="720" w:left="1080" w:header="708" w:footer="708" w:gutter="0"/>
+      <w:pgMar w:top="720" w:right="1080" w:bottom="540" w:left="1080" w:header="708" w:footer="708" w:gutter="0"/>
       <w:pgNumType/>
       <w:docGrid w:linePitch="360"/>
     </w:sectPr>

</xml_diff>

<commit_message>
Add new resume files in DOCX and PDF formats; create professional summary and core skills sections
</commit_message>
<xml_diff>
--- a/Resume-Rahul_Monde.ATS.docx
+++ b/Resume-Rahul_Monde.ATS.docx
@@ -91,7 +91,7 @@
         </w:rPr>
         <w:t xml:space="preserve">  |  </w:t>
       </w:r>
-      <w:hyperlink w:history="1" r:id="rIduiranjaipgtwoj8sxbdxk">
+      <w:hyperlink w:history="1" r:id="rIdqdnsb9qhb1wokh8twahvw">
         <w:r>
           <w:rPr>
             <w:rFonts w:ascii="Arial" w:cs="Arial" w:eastAsia="Arial" w:hAnsi="Arial"/>
@@ -109,7 +109,7 @@
         <w:spacing w:after="80"/>
         <w:jc w:val="center"/>
       </w:pPr>
-      <w:hyperlink w:history="1" r:id="rIdsr3edioquunrbwnrj86tx">
+      <w:hyperlink w:history="1" r:id="rIddcbouadoj5fjf4lriyteg">
         <w:r>
           <w:rPr>
             <w:rFonts w:ascii="Arial" w:cs="Arial" w:eastAsia="Arial" w:hAnsi="Arial"/>
@@ -130,7 +130,7 @@
         </w:rPr>
         <w:t xml:space="preserve">  |  </w:t>
       </w:r>
-      <w:hyperlink w:history="1" r:id="rId3i56vc8ycxbh6wpe6cbfo">
+      <w:hyperlink w:history="1" r:id="rIdipfygrcjwrmmmtq7mdgft">
         <w:r>
           <w:rPr>
             <w:rFonts w:ascii="Arial" w:cs="Arial" w:eastAsia="Arial" w:hAnsi="Arial"/>
@@ -151,7 +151,7 @@
         </w:rPr>
         <w:t xml:space="preserve">  |  </w:t>
       </w:r>
-      <w:hyperlink w:history="1" r:id="rIdhkes1z8mwolvdffdbdcao">
+      <w:hyperlink w:history="1" r:id="rIdagpngpegrszrt9jfrpu7b">
         <w:r>
           <w:rPr>
             <w:rFonts w:ascii="Arial" w:cs="Arial" w:eastAsia="Arial" w:hAnsi="Arial"/>
@@ -266,7 +266,7 @@
           <w:ilvl w:val="0"/>
           <w:numId w:val="2"/>
         </w:numPr>
-        <w:spacing w:after="10" w:before="10" w:line="240"/>
+        <w:spacing w:after="10" w:before="10" w:line="230"/>
       </w:pPr>
       <w:r>
         <w:rPr>
@@ -294,7 +294,7 @@
           <w:ilvl w:val="0"/>
           <w:numId w:val="2"/>
         </w:numPr>
-        <w:spacing w:after="10" w:before="10" w:line="240"/>
+        <w:spacing w:after="10" w:before="10" w:line="230"/>
       </w:pPr>
       <w:r>
         <w:rPr>
@@ -322,7 +322,7 @@
           <w:ilvl w:val="0"/>
           <w:numId w:val="2"/>
         </w:numPr>
-        <w:spacing w:after="10" w:before="10" w:line="240"/>
+        <w:spacing w:after="10" w:before="10" w:line="230"/>
       </w:pPr>
       <w:r>
         <w:rPr>
@@ -350,7 +350,7 @@
           <w:ilvl w:val="0"/>
           <w:numId w:val="2"/>
         </w:numPr>
-        <w:spacing w:after="10" w:before="10" w:line="240"/>
+        <w:spacing w:after="10" w:before="10" w:line="230"/>
       </w:pPr>
       <w:r>
         <w:rPr>
@@ -378,7 +378,7 @@
           <w:ilvl w:val="0"/>
           <w:numId w:val="2"/>
         </w:numPr>
-        <w:spacing w:after="10" w:before="10" w:line="240"/>
+        <w:spacing w:after="10" w:before="10" w:line="230"/>
       </w:pPr>
       <w:r>
         <w:rPr>
@@ -406,7 +406,7 @@
           <w:ilvl w:val="0"/>
           <w:numId w:val="2"/>
         </w:numPr>
-        <w:spacing w:after="10" w:before="10" w:line="240"/>
+        <w:spacing w:after="10" w:before="10" w:line="230"/>
       </w:pPr>
       <w:r>
         <w:rPr>
@@ -434,7 +434,7 @@
           <w:ilvl w:val="0"/>
           <w:numId w:val="2"/>
         </w:numPr>
-        <w:spacing w:after="10" w:before="10" w:line="240"/>
+        <w:spacing w:after="10" w:before="10" w:line="230"/>
       </w:pPr>
       <w:r>
         <w:rPr>
@@ -462,7 +462,7 @@
           <w:ilvl w:val="0"/>
           <w:numId w:val="2"/>
         </w:numPr>
-        <w:spacing w:after="10" w:before="10" w:line="240"/>
+        <w:spacing w:after="10" w:before="10" w:line="230"/>
       </w:pPr>
       <w:r>
         <w:rPr>
@@ -490,7 +490,7 @@
           <w:ilvl w:val="0"/>
           <w:numId w:val="2"/>
         </w:numPr>
-        <w:spacing w:after="10" w:before="10" w:line="240"/>
+        <w:spacing w:after="10" w:before="10" w:line="230"/>
       </w:pPr>
       <w:r>
         <w:rPr>
@@ -518,7 +518,7 @@
           <w:ilvl w:val="0"/>
           <w:numId w:val="2"/>
         </w:numPr>
-        <w:spacing w:after="10" w:before="10" w:line="240"/>
+        <w:spacing w:after="10" w:before="10" w:line="230"/>
       </w:pPr>
       <w:r>
         <w:rPr>
@@ -583,7 +583,7 @@
         </w:rPr>
         <w:t xml:space="preserve">13 certifications across Microsoft Azure, Google Cloud, AWS and CNCF — full wallet verifiable at </w:t>
       </w:r>
-      <w:hyperlink w:history="1" r:id="rIdztf7poq4jati54wcpbhym">
+      <w:hyperlink w:history="1" r:id="rIdx3coxdt9davltxqojnina">
         <w:r>
           <w:rPr>
             <w:rFonts w:ascii="Arial" w:cs="Arial" w:eastAsia="Arial" w:hAnsi="Arial"/>
@@ -611,7 +611,7 @@
           <w:ilvl w:val="0"/>
           <w:numId w:val="2"/>
         </w:numPr>
-        <w:spacing w:after="10" w:before="10" w:line="240"/>
+        <w:spacing w:after="10" w:before="10" w:line="230"/>
       </w:pPr>
       <w:r>
         <w:rPr>
@@ -640,7 +640,7 @@
           <w:ilvl w:val="0"/>
           <w:numId w:val="2"/>
         </w:numPr>
-        <w:spacing w:after="10" w:before="10" w:line="240"/>
+        <w:spacing w:after="10" w:before="10" w:line="230"/>
       </w:pPr>
       <w:r>
         <w:rPr>
@@ -669,7 +669,7 @@
           <w:ilvl w:val="0"/>
           <w:numId w:val="2"/>
         </w:numPr>
-        <w:spacing w:after="10" w:before="10" w:line="240"/>
+        <w:spacing w:after="10" w:before="10" w:line="230"/>
       </w:pPr>
       <w:r>
         <w:rPr>
@@ -697,7 +697,7 @@
           <w:ilvl w:val="0"/>
           <w:numId w:val="2"/>
         </w:numPr>
-        <w:spacing w:after="10" w:before="10" w:line="240"/>
+        <w:spacing w:after="10" w:before="10" w:line="230"/>
       </w:pPr>
       <w:r>
         <w:rPr>
@@ -725,7 +725,7 @@
           <w:ilvl w:val="0"/>
           <w:numId w:val="2"/>
         </w:numPr>
-        <w:spacing w:after="10" w:before="10" w:line="240"/>
+        <w:spacing w:after="10" w:before="10" w:line="230"/>
       </w:pPr>
       <w:r>
         <w:rPr>
@@ -753,7 +753,7 @@
           <w:ilvl w:val="0"/>
           <w:numId w:val="2"/>
         </w:numPr>
-        <w:spacing w:after="10" w:before="10" w:line="240"/>
+        <w:spacing w:after="10" w:before="10" w:line="230"/>
       </w:pPr>
       <w:r>
         <w:rPr>
@@ -865,7 +865,7 @@
           <w:ilvl w:val="0"/>
           <w:numId w:val="2"/>
         </w:numPr>
-        <w:spacing w:after="10" w:before="10" w:line="240"/>
+        <w:spacing w:after="10" w:before="10" w:line="230"/>
       </w:pPr>
       <w:r>
         <w:rPr>
@@ -883,7 +883,7 @@
           <w:ilvl w:val="0"/>
           <w:numId w:val="2"/>
         </w:numPr>
-        <w:spacing w:after="10" w:before="10" w:line="240"/>
+        <w:spacing w:after="10" w:before="10" w:line="230"/>
       </w:pPr>
       <w:r>
         <w:rPr>
@@ -901,7 +901,7 @@
           <w:ilvl w:val="0"/>
           <w:numId w:val="2"/>
         </w:numPr>
-        <w:spacing w:after="10" w:before="10" w:line="240"/>
+        <w:spacing w:after="10" w:before="10" w:line="230"/>
       </w:pPr>
       <w:r>
         <w:rPr>
@@ -919,7 +919,7 @@
           <w:ilvl w:val="0"/>
           <w:numId w:val="2"/>
         </w:numPr>
-        <w:spacing w:after="10" w:before="10" w:line="240"/>
+        <w:spacing w:after="10" w:before="10" w:line="230"/>
       </w:pPr>
       <w:r>
         <w:rPr>
@@ -937,25 +937,25 @@
           <w:ilvl w:val="0"/>
           <w:numId w:val="2"/>
         </w:numPr>
-        <w:spacing w:after="10" w:before="10" w:line="240"/>
-      </w:pPr>
-      <w:r>
-        <w:rPr>
-          <w:rFonts w:ascii="Arial" w:cs="Arial" w:eastAsia="Arial" w:hAnsi="Arial"/>
-          <w:sz w:val="22"/>
-          <w:szCs w:val="22"/>
-        </w:rPr>
-        <w:t xml:space="preserve">Prototyped Retrieval-Augmented Generation (RAG) applications on Azure AI Foundry and Azure AI Search to build searchable knowledge bases over enterprise document sets.</w:t>
-      </w:r>
-    </w:p>
-    <w:p>
-      <w:pPr>
-        <w:pStyle w:val="ListParagraph"/>
-        <w:numPr>
-          <w:ilvl w:val="0"/>
-          <w:numId w:val="2"/>
-        </w:numPr>
-        <w:spacing w:after="10" w:before="10" w:line="240"/>
+        <w:spacing w:after="10" w:before="10" w:line="230"/>
+      </w:pPr>
+      <w:r>
+        <w:rPr>
+          <w:rFonts w:ascii="Arial" w:cs="Arial" w:eastAsia="Arial" w:hAnsi="Arial"/>
+          <w:sz w:val="22"/>
+          <w:szCs w:val="22"/>
+        </w:rPr>
+        <w:t xml:space="preserve">Prototyped RAG applications on Azure AI Foundry to build searchable knowledge bases over enterprise document sets.</w:t>
+      </w:r>
+    </w:p>
+    <w:p>
+      <w:pPr>
+        <w:pStyle w:val="ListParagraph"/>
+        <w:numPr>
+          <w:ilvl w:val="0"/>
+          <w:numId w:val="2"/>
+        </w:numPr>
+        <w:spacing w:after="10" w:before="10" w:line="230"/>
       </w:pPr>
       <w:r>
         <w:rPr>
@@ -973,7 +973,7 @@
           <w:ilvl w:val="0"/>
           <w:numId w:val="2"/>
         </w:numPr>
-        <w:spacing w:after="10" w:before="10" w:line="240"/>
+        <w:spacing w:after="10" w:before="10" w:line="230"/>
       </w:pPr>
       <w:r>
         <w:rPr>
@@ -991,33 +991,15 @@
           <w:ilvl w:val="0"/>
           <w:numId w:val="2"/>
         </w:numPr>
-        <w:spacing w:after="10" w:before="10" w:line="240"/>
-      </w:pPr>
-      <w:r>
-        <w:rPr>
-          <w:rFonts w:ascii="Arial" w:cs="Arial" w:eastAsia="Arial" w:hAnsi="Arial"/>
-          <w:sz w:val="22"/>
-          <w:szCs w:val="22"/>
-        </w:rPr>
-        <w:t xml:space="preserve">Operate as the customer-facing technical lead: pre-sales architecture proposals, solution design reviews, and studio-level talent operations including hiring and capability planning.</w:t>
-      </w:r>
-    </w:p>
-    <w:p>
-      <w:pPr>
-        <w:pStyle w:val="ListParagraph"/>
-        <w:numPr>
-          <w:ilvl w:val="0"/>
-          <w:numId w:val="2"/>
-        </w:numPr>
-        <w:spacing w:after="10" w:before="10" w:line="240"/>
-      </w:pPr>
-      <w:r>
-        <w:rPr>
-          <w:rFonts w:ascii="Arial" w:cs="Arial" w:eastAsia="Arial" w:hAnsi="Arial"/>
-          <w:sz w:val="22"/>
-          <w:szCs w:val="22"/>
-        </w:rPr>
-        <w:t xml:space="preserve">Practitioner of AI-assisted engineering with GitHub Copilot, Factory (droid) and Claude; share learnings on LinkedIn and Medium.</w:t>
+        <w:spacing w:after="10" w:before="10" w:line="230"/>
+      </w:pPr>
+      <w:r>
+        <w:rPr>
+          <w:rFonts w:ascii="Arial" w:cs="Arial" w:eastAsia="Arial" w:hAnsi="Arial"/>
+          <w:sz w:val="22"/>
+          <w:szCs w:val="22"/>
+        </w:rPr>
+        <w:t xml:space="preserve">Operate as the customer-facing technical lead: pre-sales architecture proposals, solution design reviews, and studio-level talent operations including hiring and capability planning. Active practitioner of AI-assisted engineering (GitHub Copilot, Factory, Claude); share learnings on LinkedIn and Medium.</w:t>
       </w:r>
     </w:p>
     <w:p>
@@ -1079,7 +1061,7 @@
           <w:ilvl w:val="0"/>
           <w:numId w:val="2"/>
         </w:numPr>
-        <w:spacing w:after="10" w:before="10" w:line="240"/>
+        <w:spacing w:after="10" w:before="10" w:line="230"/>
       </w:pPr>
       <w:r>
         <w:rPr>
@@ -1097,7 +1079,7 @@
           <w:ilvl w:val="0"/>
           <w:numId w:val="2"/>
         </w:numPr>
-        <w:spacing w:after="10" w:before="10" w:line="240"/>
+        <w:spacing w:after="10" w:before="10" w:line="230"/>
       </w:pPr>
       <w:r>
         <w:rPr>
@@ -1115,7 +1097,7 @@
           <w:ilvl w:val="0"/>
           <w:numId w:val="2"/>
         </w:numPr>
-        <w:spacing w:after="10" w:before="10" w:line="240"/>
+        <w:spacing w:after="10" w:before="10" w:line="230"/>
       </w:pPr>
       <w:r>
         <w:rPr>
@@ -1185,7 +1167,7 @@
           <w:ilvl w:val="0"/>
           <w:numId w:val="2"/>
         </w:numPr>
-        <w:spacing w:after="10" w:before="10" w:line="240"/>
+        <w:spacing w:after="10" w:before="10" w:line="230"/>
       </w:pPr>
       <w:r>
         <w:rPr>
@@ -1203,7 +1185,7 @@
           <w:ilvl w:val="0"/>
           <w:numId w:val="2"/>
         </w:numPr>
-        <w:spacing w:after="10" w:before="10" w:line="240"/>
+        <w:spacing w:after="10" w:before="10" w:line="230"/>
       </w:pPr>
       <w:r>
         <w:rPr>
@@ -1273,7 +1255,7 @@
           <w:ilvl w:val="0"/>
           <w:numId w:val="2"/>
         </w:numPr>
-        <w:spacing w:after="10" w:before="10" w:line="240"/>
+        <w:spacing w:after="10" w:before="10" w:line="230"/>
       </w:pPr>
       <w:r>
         <w:rPr>
@@ -1291,7 +1273,7 @@
           <w:ilvl w:val="0"/>
           <w:numId w:val="2"/>
         </w:numPr>
-        <w:spacing w:after="10" w:before="10" w:line="240"/>
+        <w:spacing w:after="10" w:before="10" w:line="230"/>
       </w:pPr>
       <w:r>
         <w:rPr>
@@ -1361,7 +1343,7 @@
           <w:ilvl w:val="0"/>
           <w:numId w:val="2"/>
         </w:numPr>
-        <w:spacing w:after="10" w:before="10" w:line="240"/>
+        <w:spacing w:after="10" w:before="10" w:line="230"/>
       </w:pPr>
       <w:r>
         <w:rPr>
@@ -1431,15 +1413,15 @@
           <w:ilvl w:val="0"/>
           <w:numId w:val="2"/>
         </w:numPr>
-        <w:spacing w:after="10" w:before="10" w:line="240"/>
-      </w:pPr>
-      <w:r>
-        <w:rPr>
-          <w:rFonts w:ascii="Arial" w:cs="Arial" w:eastAsia="Arial" w:hAnsi="Arial"/>
-          <w:sz w:val="22"/>
-          <w:szCs w:val="22"/>
-        </w:rPr>
-        <w:t xml:space="preserve">First-line Unix support — handled incidents, server health checks and routine administration; where I learned that reproducibility is everything.</w:t>
+        <w:spacing w:after="10" w:before="10" w:line="230"/>
+      </w:pPr>
+      <w:r>
+        <w:rPr>
+          <w:rFonts w:ascii="Arial" w:cs="Arial" w:eastAsia="Arial" w:hAnsi="Arial"/>
+          <w:sz w:val="22"/>
+          <w:szCs w:val="22"/>
+        </w:rPr>
+        <w:t xml:space="preserve">First-line Unix support — handled incidents, server health checks and routine administration tasks.</w:t>
       </w:r>
     </w:p>
     <w:p>
@@ -1456,7 +1438,7 @@
           <w:sz w:val="24"/>
           <w:szCs w:val="24"/>
         </w:rPr>
-        <w:t xml:space="preserve">EDUCATION</w:t>
+        <w:t xml:space="preserve">SELECTED PROJECTS</w:t>
       </w:r>
     </w:p>
     <w:p>
@@ -1476,11 +1458,122 @@
     </w:p>
     <w:p>
       <w:pPr>
+        <w:pStyle w:val="ListParagraph"/>
+        <w:numPr>
+          <w:ilvl w:val="0"/>
+          <w:numId w:val="2"/>
+        </w:numPr>
+        <w:spacing w:after="10" w:before="10" w:line="230"/>
+      </w:pPr>
+      <w:r>
+        <w:rPr>
+          <w:rFonts w:ascii="Arial" w:cs="Arial" w:eastAsia="Arial" w:hAnsi="Arial"/>
+          <w:b/>
+          <w:bCs/>
+          <w:sz w:val="22"/>
+          <w:szCs w:val="22"/>
+        </w:rPr>
+        <w:t xml:space="preserve">Kubernetes Troubleshooting Assistant (2026, personal project) — </w:t>
+      </w:r>
+      <w:r>
+        <w:rPr>
+          <w:rFonts w:ascii="Arial" w:cs="Arial" w:eastAsia="Arial" w:hAnsi="Arial"/>
+          <w:sz w:val="22"/>
+          <w:szCs w:val="22"/>
+        </w:rPr>
+        <w:t xml:space="preserve">Built a working </w:t>
+      </w:r>
+      <w:r>
+        <w:rPr>
+          <w:rFonts w:ascii="Arial" w:cs="Arial" w:eastAsia="Arial" w:hAnsi="Arial"/>
+          <w:b/>
+          <w:bCs/>
+          <w:sz w:val="22"/>
+          <w:szCs w:val="22"/>
+        </w:rPr>
+        <w:t xml:space="preserve">RAG</w:t>
+      </w:r>
+      <w:r>
+        <w:rPr>
+          <w:rFonts w:ascii="Arial" w:cs="Arial" w:eastAsia="Arial" w:hAnsi="Arial"/>
+          <w:sz w:val="22"/>
+          <w:szCs w:val="22"/>
+        </w:rPr>
+        <w:t xml:space="preserve"> assistant on </w:t>
+      </w:r>
+      <w:r>
+        <w:rPr>
+          <w:rFonts w:ascii="Arial" w:cs="Arial" w:eastAsia="Arial" w:hAnsi="Arial"/>
+          <w:b/>
+          <w:bCs/>
+          <w:sz w:val="22"/>
+          <w:szCs w:val="22"/>
+        </w:rPr>
+        <w:t xml:space="preserve">Azure OpenAI</w:t>
+      </w:r>
+      <w:r>
+        <w:rPr>
+          <w:rFonts w:ascii="Arial" w:cs="Arial" w:eastAsia="Arial" w:hAnsi="Arial"/>
+          <w:sz w:val="22"/>
+          <w:szCs w:val="22"/>
+        </w:rPr>
+        <w:t xml:space="preserve"> (text-embedding-3-small, GPT-4o) and </w:t>
+      </w:r>
+      <w:r>
+        <w:rPr>
+          <w:rFonts w:ascii="Arial" w:cs="Arial" w:eastAsia="Arial" w:hAnsi="Arial"/>
+          <w:b/>
+          <w:bCs/>
+          <w:sz w:val="22"/>
+          <w:szCs w:val="22"/>
+        </w:rPr>
+        <w:t xml:space="preserve">Azure AI Search</w:t>
+      </w:r>
+      <w:r>
+        <w:rPr>
+          <w:rFonts w:ascii="Arial" w:cs="Arial" w:eastAsia="Arial" w:hAnsi="Arial"/>
+          <w:sz w:val="22"/>
+          <w:szCs w:val="22"/>
+        </w:rPr>
+        <w:t xml:space="preserve"> (HNSW vector index, top-3 retrieval), exposed as a </w:t>
+      </w:r>
+      <w:r>
+        <w:rPr>
+          <w:rFonts w:ascii="Arial" w:cs="Arial" w:eastAsia="Arial" w:hAnsi="Arial"/>
+          <w:b/>
+          <w:bCs/>
+          <w:sz w:val="22"/>
+          <w:szCs w:val="22"/>
+        </w:rPr>
+        <w:t xml:space="preserve">Flask</w:t>
+      </w:r>
+      <w:r>
+        <w:rPr>
+          <w:rFonts w:ascii="Arial" w:cs="Arial" w:eastAsia="Arial" w:hAnsi="Arial"/>
+          <w:sz w:val="22"/>
+          <w:szCs w:val="22"/>
+        </w:rPr>
+        <w:t xml:space="preserve"> HTTP API. Phased build: embedding verification, index creation, chunked ingestion, grounded prompt pipeline, Flask wrapper. Knowledge base covers 11 Kubernetes failure modes; answers constrained to retrieved context to prevent hallucination.</w:t>
+      </w:r>
+    </w:p>
+    <w:p>
+      <w:pPr>
         <w:tabs>
           <w:tab w:val="right" w:pos="9360"/>
         </w:tabs>
-        <w:spacing w:after="0" w:before="30"/>
-      </w:pPr>
+        <w:spacing w:after="0" w:before="60"/>
+      </w:pPr>
+      <w:r>
+        <w:rPr>
+          <w:rFonts w:ascii="Arial" w:cs="Arial" w:eastAsia="Arial" w:hAnsi="Arial"/>
+          <w:b/>
+          <w:bCs/>
+          <w:color w:val="1F3A5F"/>
+          <w:sz w:val="22"/>
+          <w:szCs w:val="22"/>
+        </w:rPr>
+        <w:t xml:space="preserve">Education: </w:t>
+      </w:r>
       <w:r>
         <w:rPr>
           <w:rFonts w:ascii="Arial" w:cs="Arial" w:eastAsia="Arial" w:hAnsi="Arial"/>
@@ -1503,7 +1596,7 @@
     </w:p>
     <w:sectPr>
       <w:pgSz w:w="12240" w:h="15840" w:orient="portrait"/>
-      <w:pgMar w:top="720" w:right="1080" w:bottom="540" w:left="1080" w:header="708" w:footer="708" w:gutter="0"/>
+      <w:pgMar w:top="600" w:right="1080" w:bottom="432" w:left="1080" w:header="708" w:footer="708" w:gutter="0"/>
       <w:pgNumType/>
       <w:docGrid w:linePitch="360"/>
     </w:sectPr>

</xml_diff>

<commit_message>
Update resume files and enhance project descriptions; add styling for project links
</commit_message>
<xml_diff>
--- a/Resume-Rahul_Monde.ATS.docx
+++ b/Resume-Rahul_Monde.ATS.docx
@@ -91,7 +91,7 @@
         </w:rPr>
         <w:t xml:space="preserve">  |  </w:t>
       </w:r>
-      <w:hyperlink w:history="1" r:id="rIdqdnsb9qhb1wokh8twahvw">
+      <w:hyperlink w:history="1" r:id="rIduxdtvoehl_6hbtfd7alex">
         <w:r>
           <w:rPr>
             <w:rFonts w:ascii="Arial" w:cs="Arial" w:eastAsia="Arial" w:hAnsi="Arial"/>
@@ -109,7 +109,7 @@
         <w:spacing w:after="80"/>
         <w:jc w:val="center"/>
       </w:pPr>
-      <w:hyperlink w:history="1" r:id="rIddcbouadoj5fjf4lriyteg">
+      <w:hyperlink w:history="1" r:id="rId-pfzcoogniqlb6bopfn88">
         <w:r>
           <w:rPr>
             <w:rFonts w:ascii="Arial" w:cs="Arial" w:eastAsia="Arial" w:hAnsi="Arial"/>
@@ -130,7 +130,7 @@
         </w:rPr>
         <w:t xml:space="preserve">  |  </w:t>
       </w:r>
-      <w:hyperlink w:history="1" r:id="rIdipfygrcjwrmmmtq7mdgft">
+      <w:hyperlink w:history="1" r:id="rIdtnvohi3nchdxazwjxlgbd">
         <w:r>
           <w:rPr>
             <w:rFonts w:ascii="Arial" w:cs="Arial" w:eastAsia="Arial" w:hAnsi="Arial"/>
@@ -151,7 +151,7 @@
         </w:rPr>
         <w:t xml:space="preserve">  |  </w:t>
       </w:r>
-      <w:hyperlink w:history="1" r:id="rIdagpngpegrszrt9jfrpu7b">
+      <w:hyperlink w:history="1" r:id="rId4wu8fgk2ghxbdrqndpwxs">
         <w:r>
           <w:rPr>
             <w:rFonts w:ascii="Arial" w:cs="Arial" w:eastAsia="Arial" w:hAnsi="Arial"/>
@@ -583,7 +583,7 @@
         </w:rPr>
         <w:t xml:space="preserve">13 certifications across Microsoft Azure, Google Cloud, AWS and CNCF — full wallet verifiable at </w:t>
       </w:r>
-      <w:hyperlink w:history="1" r:id="rIdx3coxdt9davltxqojnina">
+      <w:hyperlink w:history="1" r:id="rIdzzqsmrsjz3bhkojll_fr8">
         <w:r>
           <w:rPr>
             <w:rFonts w:ascii="Arial" w:cs="Arial" w:eastAsia="Arial" w:hAnsi="Arial"/>
@@ -1553,8 +1553,20 @@
           <w:sz w:val="22"/>
           <w:szCs w:val="22"/>
         </w:rPr>
-        <w:t xml:space="preserve"> HTTP API. Phased build: embedding verification, index creation, chunked ingestion, grounded prompt pipeline, Flask wrapper. Knowledge base covers 11 Kubernetes failure modes; answers constrained to retrieved context to prevent hallucination.</w:t>
-      </w:r>
+        <w:t xml:space="preserve"> HTTP API. Phased build: embedding verification, index creation, chunked ingestion, grounded prompt pipeline, Flask wrapper. Knowledge base covers 11 Kubernetes failure modes; answers constrained to retrieved context to prevent hallucination. </w:t>
+      </w:r>
+      <w:hyperlink w:history="1" r:id="rIdu0idu1bdz7vs2hlos_8ny">
+        <w:r>
+          <w:rPr>
+            <w:rFonts w:ascii="Arial" w:cs="Arial" w:eastAsia="Arial" w:hAnsi="Arial"/>
+            <w:color w:val="4361EE"/>
+            <w:sz w:val="22"/>
+            <w:szCs w:val="22"/>
+            <w:u w:val="single"/>
+          </w:rPr>
+          <w:t xml:space="preserve">github.com/rmonde/Kubernetes-assistant</w:t>
+        </w:r>
+      </w:hyperlink>
     </w:p>
     <w:p>
       <w:pPr>

</xml_diff>

<commit_message>
Update resume files and enhance skills and project descriptions; add new technologies and projects
</commit_message>
<xml_diff>
--- a/Resume-Rahul_Monde.ATS.docx
+++ b/Resume-Rahul_Monde.ATS.docx
@@ -91,7 +91,7 @@
         </w:rPr>
         <w:t xml:space="preserve">  |  </w:t>
       </w:r>
-      <w:hyperlink w:history="1" r:id="rIduxdtvoehl_6hbtfd7alex">
+      <w:hyperlink w:history="1" r:id="rIdkxj5csjhoc_2wrt3uy7qn">
         <w:r>
           <w:rPr>
             <w:rFonts w:ascii="Arial" w:cs="Arial" w:eastAsia="Arial" w:hAnsi="Arial"/>
@@ -109,7 +109,7 @@
         <w:spacing w:after="80"/>
         <w:jc w:val="center"/>
       </w:pPr>
-      <w:hyperlink w:history="1" r:id="rId-pfzcoogniqlb6bopfn88">
+      <w:hyperlink w:history="1" r:id="rId7hwxoklpy8fbd0p3s96pr">
         <w:r>
           <w:rPr>
             <w:rFonts w:ascii="Arial" w:cs="Arial" w:eastAsia="Arial" w:hAnsi="Arial"/>
@@ -130,7 +130,7 @@
         </w:rPr>
         <w:t xml:space="preserve">  |  </w:t>
       </w:r>
-      <w:hyperlink w:history="1" r:id="rIdtnvohi3nchdxazwjxlgbd">
+      <w:hyperlink w:history="1" r:id="rIdwyql5mqga_gh1rrinf9-x">
         <w:r>
           <w:rPr>
             <w:rFonts w:ascii="Arial" w:cs="Arial" w:eastAsia="Arial" w:hAnsi="Arial"/>
@@ -151,7 +151,7 @@
         </w:rPr>
         <w:t xml:space="preserve">  |  </w:t>
       </w:r>
-      <w:hyperlink w:history="1" r:id="rId4wu8fgk2ghxbdrqndpwxs">
+      <w:hyperlink w:history="1" r:id="rIdbmzpj_dq_pm34alnc2cys">
         <w:r>
           <w:rPr>
             <w:rFonts w:ascii="Arial" w:cs="Arial" w:eastAsia="Arial" w:hAnsi="Arial"/>
@@ -396,7 +396,7 @@
           <w:sz w:val="22"/>
           <w:szCs w:val="22"/>
         </w:rPr>
-        <w:t xml:space="preserve">Azure DevOps pipelines, CI/CD design, GitHub, GitHub Copilot pair-programming, JFrog Artifactory, release automation.</w:t>
+        <w:t xml:space="preserve">Azure DevOps pipelines, GitHub Actions, CI/CD design, GitOps with ArgoCD (App of Apps, ApplicationSet, Kustomize overlays), JFrog Artifactory, release automation.</w:t>
       </w:r>
     </w:p>
     <w:p>
@@ -508,35 +508,35 @@
           <w:sz w:val="22"/>
           <w:szCs w:val="22"/>
         </w:rPr>
-        <w:t xml:space="preserve">Prometheus, Grafana (foundational), reliability engineering practices, incident response.</w:t>
-      </w:r>
-    </w:p>
-    <w:p>
-      <w:pPr>
-        <w:pStyle w:val="ListParagraph"/>
-        <w:numPr>
-          <w:ilvl w:val="0"/>
-          <w:numId w:val="2"/>
-        </w:numPr>
-        <w:spacing w:after="10" w:before="10" w:line="230"/>
-      </w:pPr>
-      <w:r>
-        <w:rPr>
-          <w:rFonts w:ascii="Arial" w:cs="Arial" w:eastAsia="Arial" w:hAnsi="Arial"/>
-          <w:b/>
-          <w:bCs/>
-          <w:sz w:val="22"/>
-          <w:szCs w:val="22"/>
-        </w:rPr>
-        <w:t xml:space="preserve">Leadership: </w:t>
-      </w:r>
-      <w:r>
-        <w:rPr>
-          <w:rFonts w:ascii="Arial" w:cs="Arial" w:eastAsia="Arial" w:hAnsi="Arial"/>
-          <w:sz w:val="22"/>
-          <w:szCs w:val="22"/>
-        </w:rPr>
-        <w:t xml:space="preserve">Pre-sales solution proposals, technical leadership, talent operations, customer architecture reviews, knowledge sharing (LinkedIn, Medium).</w:t>
+        <w:t xml:space="preserve">Prometheus, kube-prometheus-stack Operator, PromQL (rate, histogram_quantile, recording rules, ServiceMonitor), Grafana (learning), SRE / reliability practices, incident response.</w:t>
+      </w:r>
+    </w:p>
+    <w:p>
+      <w:pPr>
+        <w:pStyle w:val="ListParagraph"/>
+        <w:numPr>
+          <w:ilvl w:val="0"/>
+          <w:numId w:val="2"/>
+        </w:numPr>
+        <w:spacing w:after="10" w:before="10" w:line="230"/>
+      </w:pPr>
+      <w:r>
+        <w:rPr>
+          <w:rFonts w:ascii="Arial" w:cs="Arial" w:eastAsia="Arial" w:hAnsi="Arial"/>
+          <w:b/>
+          <w:bCs/>
+          <w:sz w:val="22"/>
+          <w:szCs w:val="22"/>
+        </w:rPr>
+        <w:t xml:space="preserve">System Design &amp; Leadership: </w:t>
+      </w:r>
+      <w:r>
+        <w:rPr>
+          <w:rFonts w:ascii="Arial" w:cs="Arial" w:eastAsia="Arial" w:hAnsi="Arial"/>
+          <w:sz w:val="22"/>
+          <w:szCs w:val="22"/>
+        </w:rPr>
+        <w:t xml:space="preserve">AWS + Azure Well-Architected Framework 5-pillar design practice, pre-sales proposals, technical leadership, talent operations, customer architecture reviews, knowledge sharing (LinkedIn, Medium).</w:t>
       </w:r>
     </w:p>
     <w:p>
@@ -583,7 +583,7 @@
         </w:rPr>
         <w:t xml:space="preserve">13 certifications across Microsoft Azure, Google Cloud, AWS and CNCF — full wallet verifiable at </w:t>
       </w:r>
-      <w:hyperlink w:history="1" r:id="rIdzzqsmrsjz3bhkojll_fr8">
+      <w:hyperlink w:history="1" r:id="rIddtbagcipt8erowgxw-7a-">
         <w:r>
           <w:rPr>
             <w:rFonts w:ascii="Arial" w:cs="Arial" w:eastAsia="Arial" w:hAnsi="Arial"/>
@@ -1553,9 +1553,9 @@
           <w:sz w:val="22"/>
           <w:szCs w:val="22"/>
         </w:rPr>
-        <w:t xml:space="preserve"> HTTP API. Phased build: embedding verification, index creation, chunked ingestion, grounded prompt pipeline, Flask wrapper. Knowledge base covers 11 Kubernetes failure modes; answers constrained to retrieved context to prevent hallucination. </w:t>
-      </w:r>
-      <w:hyperlink w:history="1" r:id="rIdu0idu1bdz7vs2hlos_8ny">
+        <w:t xml:space="preserve"> HTTP API. Phased build: embedding verification, index creation, chunked ingestion, grounded prompt pipeline, Flask wrapper. Knowledge base covers 11 Kubernetes failure modes. </w:t>
+      </w:r>
+      <w:hyperlink w:history="1" r:id="rIdpcan0phc1zf1dhg19asfu">
         <w:r>
           <w:rPr>
             <w:rFonts w:ascii="Arial" w:cs="Arial" w:eastAsia="Arial" w:hAnsi="Arial"/>
@@ -1573,7 +1573,7 @@
         <w:tabs>
           <w:tab w:val="right" w:pos="9360"/>
         </w:tabs>
-        <w:spacing w:after="0" w:before="60"/>
+        <w:spacing w:after="0" w:before="20"/>
       </w:pPr>
       <w:r>
         <w:rPr>
@@ -1608,7 +1608,7 @@
     </w:p>
     <w:sectPr>
       <w:pgSz w:w="12240" w:h="15840" w:orient="portrait"/>
-      <w:pgMar w:top="600" w:right="1080" w:bottom="432" w:left="1080" w:header="708" w:footer="708" w:gutter="0"/>
+      <w:pgMar w:top="500" w:right="1080" w:bottom="360" w:left="1080" w:header="708" w:footer="708" w:gutter="0"/>
       <w:pgNumType/>
       <w:docGrid w:linePitch="360"/>
     </w:sectPr>

</xml_diff>